<commit_message>
comment on the code
</commit_message>
<xml_diff>
--- a/draft/draft_Aenictus.docx
+++ b/draft/draft_Aenictus.docx
@@ -2615,7 +2615,55 @@
           <w:sz w:val="22"/>
           <w:szCs w:val="22"/>
         </w:rPr>
-        <w:t xml:space="preserve">During bridge formation, the minimum number of ants present in the gap area was seven, indicating that at least seven individuals were required to span the 5.3 mm gap. The number of ants near the gap was positively correlated with traffic flow (linear model: </w:t>
+        <w:t>During bridge formation, the minimum number of ants present in the gap area was seven, indicating that at least seven individuals were required to span the 5.3 mm gap. The number of ants near the gap was positively correlated with traffic flow (linear model</w:t>
+      </w:r>
+      <w:r>
+        <w:rPr>
+          <w:rFonts w:ascii="Arial" w:hAnsi="Arial" w:cs="Arial" w:hint="eastAsia"/>
+          <w:sz w:val="22"/>
+          <w:szCs w:val="22"/>
+        </w:rPr>
+        <w:t>,</w:t>
+      </w:r>
+      <w:r>
+        <w:rPr>
+          <w:rFonts w:ascii="Arial" w:hAnsi="Arial" w:cs="Arial" w:hint="eastAsia"/>
+          <w:sz w:val="22"/>
+          <w:szCs w:val="22"/>
+        </w:rPr>
+        <w:t xml:space="preserve"> the</w:t>
+      </w:r>
+      <w:r>
+        <w:rPr>
+          <w:rFonts w:ascii="Arial" w:hAnsi="Arial" w:cs="Arial" w:hint="eastAsia"/>
+          <w:sz w:val="22"/>
+          <w:szCs w:val="22"/>
+        </w:rPr>
+        <w:t xml:space="preserve"> effect of </w:t>
+      </w:r>
+      <w:r>
+        <w:rPr>
+          <w:rFonts w:ascii="Arial" w:hAnsi="Arial" w:cs="Arial" w:hint="eastAsia"/>
+          <w:sz w:val="22"/>
+          <w:szCs w:val="22"/>
+        </w:rPr>
+        <w:t>the n</w:t>
+      </w:r>
+      <w:r>
+        <w:rPr>
+          <w:rFonts w:ascii="Arial" w:hAnsi="Arial" w:cs="Arial" w:hint="eastAsia"/>
+          <w:sz w:val="22"/>
+          <w:szCs w:val="22"/>
+        </w:rPr>
+        <w:t>umber of ants near the gap:</w:t>
+      </w:r>
+      <w:r>
+        <w:rPr>
+          <w:rFonts w:ascii="Arial" w:hAnsi="Arial" w:cs="Arial"/>
+          <w:sz w:val="22"/>
+          <w:szCs w:val="22"/>
+        </w:rPr>
+        <w:t xml:space="preserve"> </w:t>
       </w:r>
       <w:r>
         <w:rPr>
@@ -2659,7 +2707,7 @@
           <w:sz w:val="22"/>
           <w:szCs w:val="22"/>
         </w:rPr>
-        <w:t xml:space="preserve"> &lt; 0.001, </w:t>
+        <w:t xml:space="preserve"> &lt; 0.001, Fig. S2), and the slope of this relationship was </w:t>
       </w:r>
       <w:r>
         <w:rPr>
@@ -2668,7 +2716,31 @@
           <w:szCs w:val="22"/>
         </w:rPr>
         <w:lastRenderedPageBreak/>
-        <w:t>Fig. S2), and the slope of this relationship was significantly steeper when the bridge was present (</w:t>
+        <w:t>significantly steeper when the bridge was present (</w:t>
+      </w:r>
+      <w:r>
+        <w:rPr>
+          <w:rFonts w:ascii="Arial" w:hAnsi="Arial" w:cs="Arial" w:hint="eastAsia"/>
+          <w:sz w:val="22"/>
+          <w:szCs w:val="22"/>
+        </w:rPr>
+        <w:t xml:space="preserve">the effect of </w:t>
+      </w:r>
+      <w:r>
+        <w:rPr>
+          <w:rFonts w:ascii="Arial" w:hAnsi="Arial" w:cs="Arial"/>
+          <w:sz w:val="22"/>
+          <w:szCs w:val="22"/>
+        </w:rPr>
+        <w:t>interactions</w:t>
+      </w:r>
+      <w:r>
+        <w:rPr>
+          <w:rFonts w:ascii="Arial" w:hAnsi="Arial" w:cs="Arial" w:hint="eastAsia"/>
+          <w:sz w:val="22"/>
+          <w:szCs w:val="22"/>
+        </w:rPr>
+        <w:t xml:space="preserve">: </w:t>
       </w:r>
       <w:r>
         <w:rPr>
@@ -5340,6 +5412,7 @@
   <w:style w:type="character" w:default="1" w:styleId="DefaultParagraphFont">
     <w:name w:val="Default Paragraph Font"/>
     <w:uiPriority w:val="1"/>
+    <w:semiHidden/>
     <w:unhideWhenUsed/>
   </w:style>
   <w:style w:type="table" w:default="1" w:styleId="TableNormal">
@@ -6103,23 +6176,10 @@
 </file>
 
 <file path=customXml/item1.xml><?xml version="1.0" encoding="utf-8"?>
-<p:properties xmlns:p="http://schemas.microsoft.com/office/2006/metadata/properties" xmlns:xsi="http://www.w3.org/2001/XMLSchema-instance" xmlns:pc="http://schemas.microsoft.com/office/infopath/2007/PartnerControls">
-  <documentManagement>
-    <_activity xmlns="e76338a4-8abb-4402-af3f-de7d9f3d503c" xsi:nil="true"/>
-  </documentManagement>
-</p:properties>
+<b:Sources xmlns:b="http://schemas.openxmlformats.org/officeDocument/2006/bibliography" xmlns="http://schemas.openxmlformats.org/officeDocument/2006/bibliography" SelectedStyle="\APASixthEditionOfficeOnline.xsl" StyleName="APA" Version="6"/>
 </file>
 
 <file path=customXml/item2.xml><?xml version="1.0" encoding="utf-8"?>
-<?mso-contentType ?>
-<FormTemplates xmlns="http://schemas.microsoft.com/sharepoint/v3/contenttype/forms">
-  <Display>DocumentLibraryForm</Display>
-  <Edit>DocumentLibraryForm</Edit>
-  <New>DocumentLibraryForm</New>
-</FormTemplates>
-</file>
-
-<file path=customXml/item3.xml><?xml version="1.0" encoding="utf-8"?>
 <ct:contentTypeSchema xmlns:ct="http://schemas.microsoft.com/office/2006/metadata/contentType" xmlns:ma="http://schemas.microsoft.com/office/2006/metadata/properties/metaAttributes" ct:_="" ma:_="" ma:contentTypeName="Document" ma:contentTypeID="0x010100E14DEDB2733D7E41ACA7187448E59CCD" ma:contentTypeVersion="16" ma:contentTypeDescription="Create a new document." ma:contentTypeScope="" ma:versionID="7dbeacb565a3265d9cf13672b785be8e">
   <xsd:schema xmlns:xsd="http://www.w3.org/2001/XMLSchema" xmlns:xs="http://www.w3.org/2001/XMLSchema" xmlns:p="http://schemas.microsoft.com/office/2006/metadata/properties" xmlns:ns3="e76338a4-8abb-4402-af3f-de7d9f3d503c" xmlns:ns4="7a51d82f-bf82-478a-b4f4-a9b9c89f28a6" targetNamespace="http://schemas.microsoft.com/office/2006/metadata/properties" ma:root="true" ma:fieldsID="bd1a83a0ec5f19375b2213de969037e0" ns3:_="" ns4:_="">
     <xsd:import namespace="e76338a4-8abb-4402-af3f-de7d9f3d503c"/>
@@ -6358,29 +6418,32 @@
 </ct:contentTypeSchema>
 </file>
 
+<file path=customXml/item3.xml><?xml version="1.0" encoding="utf-8"?>
+<?mso-contentType ?>
+<FormTemplates xmlns="http://schemas.microsoft.com/sharepoint/v3/contenttype/forms">
+  <Display>DocumentLibraryForm</Display>
+  <Edit>DocumentLibraryForm</Edit>
+  <New>DocumentLibraryForm</New>
+</FormTemplates>
+</file>
+
 <file path=customXml/item4.xml><?xml version="1.0" encoding="utf-8"?>
-<b:Sources xmlns:b="http://schemas.openxmlformats.org/officeDocument/2006/bibliography" xmlns="http://schemas.openxmlformats.org/officeDocument/2006/bibliography" SelectedStyle="\APASixthEditionOfficeOnline.xsl" StyleName="APA" Version="6"/>
+<p:properties xmlns:p="http://schemas.microsoft.com/office/2006/metadata/properties" xmlns:xsi="http://www.w3.org/2001/XMLSchema-instance" xmlns:pc="http://schemas.microsoft.com/office/infopath/2007/PartnerControls">
+  <documentManagement>
+    <_activity xmlns="e76338a4-8abb-4402-af3f-de7d9f3d503c" xsi:nil="true"/>
+  </documentManagement>
+</p:properties>
 </file>
 
 <file path=customXml/itemProps1.xml><?xml version="1.0" encoding="utf-8"?>
-<ds:datastoreItem xmlns:ds="http://schemas.openxmlformats.org/officeDocument/2006/customXml" ds:itemID="{641EDFA5-26F5-4FAA-B2DA-551B73C5B4A5}">
+<ds:datastoreItem xmlns:ds="http://schemas.openxmlformats.org/officeDocument/2006/customXml" ds:itemID="{209F5630-1EC2-4AA3-A1BA-21A166CA3DAE}">
   <ds:schemaRefs>
-    <ds:schemaRef ds:uri="http://schemas.microsoft.com/office/2006/metadata/properties"/>
-    <ds:schemaRef ds:uri="http://schemas.microsoft.com/office/infopath/2007/PartnerControls"/>
-    <ds:schemaRef ds:uri="e76338a4-8abb-4402-af3f-de7d9f3d503c"/>
+    <ds:schemaRef ds:uri="http://schemas.openxmlformats.org/officeDocument/2006/bibliography"/>
   </ds:schemaRefs>
 </ds:datastoreItem>
 </file>
 
 <file path=customXml/itemProps2.xml><?xml version="1.0" encoding="utf-8"?>
-<ds:datastoreItem xmlns:ds="http://schemas.openxmlformats.org/officeDocument/2006/customXml" ds:itemID="{3A56D66D-E932-4A17-8F0E-6EEECE158A9D}">
-  <ds:schemaRefs>
-    <ds:schemaRef ds:uri="http://schemas.microsoft.com/sharepoint/v3/contenttype/forms"/>
-  </ds:schemaRefs>
-</ds:datastoreItem>
-</file>
-
-<file path=customXml/itemProps3.xml><?xml version="1.0" encoding="utf-8"?>
 <ds:datastoreItem xmlns:ds="http://schemas.openxmlformats.org/officeDocument/2006/customXml" ds:itemID="{2D9BA390-375C-4E1B-8530-81D478B7DFBE}">
   <ds:schemaRefs>
     <ds:schemaRef ds:uri="http://schemas.microsoft.com/office/2006/metadata/contentType"/>
@@ -6399,10 +6462,20 @@
 </ds:datastoreItem>
 </file>
 
+<file path=customXml/itemProps3.xml><?xml version="1.0" encoding="utf-8"?>
+<ds:datastoreItem xmlns:ds="http://schemas.openxmlformats.org/officeDocument/2006/customXml" ds:itemID="{3A56D66D-E932-4A17-8F0E-6EEECE158A9D}">
+  <ds:schemaRefs>
+    <ds:schemaRef ds:uri="http://schemas.microsoft.com/sharepoint/v3/contenttype/forms"/>
+  </ds:schemaRefs>
+</ds:datastoreItem>
+</file>
+
 <file path=customXml/itemProps4.xml><?xml version="1.0" encoding="utf-8"?>
-<ds:datastoreItem xmlns:ds="http://schemas.openxmlformats.org/officeDocument/2006/customXml" ds:itemID="{209F5630-1EC2-4AA3-A1BA-21A166CA3DAE}">
+<ds:datastoreItem xmlns:ds="http://schemas.openxmlformats.org/officeDocument/2006/customXml" ds:itemID="{641EDFA5-26F5-4FAA-B2DA-551B73C5B4A5}">
   <ds:schemaRefs>
-    <ds:schemaRef ds:uri="http://schemas.openxmlformats.org/officeDocument/2006/bibliography"/>
+    <ds:schemaRef ds:uri="http://schemas.microsoft.com/office/2006/metadata/properties"/>
+    <ds:schemaRef ds:uri="http://schemas.microsoft.com/office/infopath/2007/PartnerControls"/>
+    <ds:schemaRef ds:uri="e76338a4-8abb-4402-af3f-de7d9f3d503c"/>
   </ds:schemaRefs>
 </ds:datastoreItem>
 </file>
</xml_diff>